<commit_message>
feat: prepare disaster safety platform for Vercel
</commit_message>
<xml_diff>
--- a/작성서류/[제품및서비스개발]_유창재_침수퇴로AI.docx
+++ b/작성서류/[제품및서비스개발]_유창재_침수퇴로AI.docx
@@ -114,7 +114,7 @@
         <w:pStyle w:val="HWP0"/>
         <w:spacing w:before="366" w:line="369" w:lineRule="auto"/>
         <w:rPr>
-          <w:rFonts w:ascii="NanumGothic" w:eastAsia="NanumGothic" w:hAnsi="NanumGothic" w:hint="eastAsia"/>
+          <w:rFonts w:ascii="NanumGothic" w:eastAsia="NanumGothic" w:hAnsi="NanumGothic"/>
           <w:b/>
           <w:color w:val="0000FF"/>
           <w:sz w:val="22"/>
@@ -3785,7 +3785,7 @@
         <w:ind w:left="790" w:hanging="790"/>
         <w:textAlignment w:val="center"/>
         <w:rPr>
-          <w:rFonts w:ascii="NanumGothic" w:eastAsia="NanumGothic" w:hAnsi="NanumGothic" w:hint="eastAsia"/>
+          <w:rFonts w:ascii="NanumGothic" w:eastAsia="NanumGothic" w:hAnsi="NanumGothic"/>
           <w:b/>
           <w:color w:val="0000FF"/>
           <w:sz w:val="22"/>
@@ -5912,7 +5912,7 @@
         </w:tabs>
         <w:spacing w:line="328" w:lineRule="auto"/>
         <w:rPr>
-          <w:rFonts w:ascii="맑은 고딕" w:eastAsia="맑은 고딕" w:hAnsi="맑은 고딕"/>
+          <w:rFonts w:ascii="맑은 고딕" w:eastAsia="맑은 고딕" w:hAnsi="맑은 고딕" w:hint="eastAsia"/>
           <w:sz w:val="24"/>
           <w:lang w:eastAsia="ko-KR"/>
         </w:rPr>
@@ -5928,46 +5928,17 @@
         <w:spacing w:line="328" w:lineRule="auto"/>
         <w:rPr>
           <w:rFonts w:ascii="맑은 고딕" w:eastAsia="맑은 고딕" w:hAnsi="맑은 고딕"/>
-          <w:sz w:val="24"/>
+          <w:sz w:val="30"/>
           <w:lang w:eastAsia="ko-KR"/>
         </w:rPr>
       </w:pPr>
-    </w:p>
-    <w:p>
-      <w:pPr>
-        <w:pStyle w:val="HWP0"/>
-        <w:tabs>
-          <w:tab w:val="left" w:leader="hyphen" w:pos="6860"/>
-          <w:tab w:val="left" w:leader="hyphen" w:pos="8220"/>
-        </w:tabs>
-        <w:spacing w:line="328" w:lineRule="auto"/>
-        <w:rPr>
-          <w:rFonts w:ascii="맑은 고딕" w:eastAsia="맑은 고딕" w:hAnsi="맑은 고딕"/>
-          <w:sz w:val="24"/>
-          <w:lang w:eastAsia="ko-KR"/>
-        </w:rPr>
-      </w:pPr>
-    </w:p>
-    <w:p>
-      <w:pPr>
-        <w:pStyle w:val="HWP0"/>
-        <w:tabs>
-          <w:tab w:val="left" w:leader="hyphen" w:pos="6860"/>
-          <w:tab w:val="left" w:leader="hyphen" w:pos="8220"/>
-        </w:tabs>
-        <w:spacing w:line="328" w:lineRule="auto"/>
+      <w:r>
         <w:rPr>
           <w:rFonts w:ascii="맑은 고딕" w:eastAsia="맑은 고딕" w:hAnsi="맑은 고딕"/>
           <w:sz w:val="30"/>
           <w:lang w:eastAsia="ko-KR"/>
         </w:rPr>
-      </w:pPr>
-      <w:r>
-        <w:rPr>
-          <w:rFonts w:ascii="맑은 고딕" w:eastAsia="맑은 고딕" w:hAnsi="맑은 고딕"/>
-          <w:sz w:val="30"/>
-          <w:lang w:eastAsia="ko-KR"/>
-        </w:rPr>
+        <w:lastRenderedPageBreak/>
         <w:t>5. 데이터 활용성 및 사업화 가능성</w:t>
       </w:r>
     </w:p>
@@ -6339,6 +6310,83 @@
         </w:rPr>
         <w:br/>
       </w:r>
+    </w:p>
+    <w:p>
+      <w:pPr>
+        <w:pStyle w:val="HWP0"/>
+        <w:tabs>
+          <w:tab w:val="left" w:leader="hyphen" w:pos="6860"/>
+          <w:tab w:val="left" w:leader="hyphen" w:pos="8220"/>
+        </w:tabs>
+        <w:spacing w:line="328" w:lineRule="auto"/>
+        <w:jc w:val="right"/>
+        <w:rPr>
+          <w:sz w:val="22"/>
+          <w:lang w:eastAsia="ko-KR"/>
+        </w:rPr>
+      </w:pPr>
+    </w:p>
+    <w:p>
+      <w:pPr>
+        <w:pStyle w:val="HWP0"/>
+        <w:tabs>
+          <w:tab w:val="left" w:leader="hyphen" w:pos="6860"/>
+          <w:tab w:val="left" w:leader="hyphen" w:pos="8220"/>
+        </w:tabs>
+        <w:spacing w:line="328" w:lineRule="auto"/>
+        <w:jc w:val="right"/>
+        <w:rPr>
+          <w:sz w:val="22"/>
+          <w:lang w:eastAsia="ko-KR"/>
+        </w:rPr>
+      </w:pPr>
+    </w:p>
+    <w:p>
+      <w:pPr>
+        <w:pStyle w:val="HWP0"/>
+        <w:tabs>
+          <w:tab w:val="left" w:leader="hyphen" w:pos="6860"/>
+          <w:tab w:val="left" w:leader="hyphen" w:pos="8220"/>
+        </w:tabs>
+        <w:spacing w:line="328" w:lineRule="auto"/>
+        <w:jc w:val="right"/>
+        <w:rPr>
+          <w:sz w:val="22"/>
+          <w:lang w:eastAsia="ko-KR"/>
+        </w:rPr>
+      </w:pPr>
+    </w:p>
+    <w:p>
+      <w:pPr>
+        <w:pStyle w:val="HWP0"/>
+        <w:tabs>
+          <w:tab w:val="left" w:leader="hyphen" w:pos="6860"/>
+          <w:tab w:val="left" w:leader="hyphen" w:pos="8220"/>
+        </w:tabs>
+        <w:spacing w:line="328" w:lineRule="auto"/>
+        <w:jc w:val="right"/>
+        <w:rPr>
+          <w:rFonts w:hint="eastAsia"/>
+          <w:sz w:val="22"/>
+          <w:lang w:eastAsia="ko-KR"/>
+        </w:rPr>
+      </w:pPr>
+    </w:p>
+    <w:p>
+      <w:pPr>
+        <w:pStyle w:val="HWP0"/>
+        <w:tabs>
+          <w:tab w:val="left" w:leader="hyphen" w:pos="6860"/>
+          <w:tab w:val="left" w:leader="hyphen" w:pos="8220"/>
+        </w:tabs>
+        <w:spacing w:line="328" w:lineRule="auto"/>
+        <w:jc w:val="right"/>
+        <w:rPr>
+          <w:rFonts w:hint="eastAsia"/>
+          <w:sz w:val="22"/>
+          <w:lang w:eastAsia="ko-KR"/>
+        </w:rPr>
+      </w:pPr>
     </w:p>
     <w:tbl>
       <w:tblPr>
@@ -6390,6 +6438,7 @@
                 <w:spacing w:val="-49"/>
                 <w:sz w:val="34"/>
               </w:rPr>
+              <w:lastRenderedPageBreak/>
               <w:t>붙임 3</w:t>
             </w:r>
           </w:p>
@@ -6453,33 +6502,22 @@
         <w:spacing w:before="210" w:line="328" w:lineRule="auto"/>
         <w:ind w:left="304" w:hanging="304"/>
         <w:rPr>
+          <w:rFonts w:ascii="HY헤드라인M" w:eastAsia="HY헤드라인M" w:hAnsi="HY헤드라인M" w:hint="eastAsia"/>
+          <w:spacing w:val="-10"/>
+          <w:w w:val="97"/>
+          <w:sz w:val="46"/>
+          <w:lang w:eastAsia="ko-KR"/>
+        </w:rPr>
+      </w:pPr>
+      <w:r>
+        <w:rPr>
           <w:rFonts w:ascii="HY헤드라인M" w:eastAsia="HY헤드라인M" w:hAnsi="HY헤드라인M"/>
           <w:spacing w:val="-10"/>
           <w:w w:val="97"/>
           <w:sz w:val="46"/>
         </w:rPr>
-      </w:pPr>
-      <w:r>
-        <w:rPr>
-          <w:rFonts w:ascii="HY헤드라인M" w:eastAsia="HY헤드라인M" w:hAnsi="HY헤드라인M"/>
-          <w:spacing w:val="-10"/>
-          <w:w w:val="97"/>
-          <w:sz w:val="46"/>
-        </w:rPr>
         <w:t>참가자 서약서</w:t>
       </w:r>
-    </w:p>
-    <w:p>
-      <w:pPr>
-        <w:pStyle w:val="HWP0"/>
-        <w:spacing w:line="328" w:lineRule="auto"/>
-        <w:jc w:val="left"/>
-        <w:rPr>
-          <w:rFonts w:ascii="NanumGothic" w:eastAsia="휴먼명조" w:hAnsi="NanumGothic"/>
-          <w:spacing w:val="-26"/>
-          <w:sz w:val="30"/>
-        </w:rPr>
-      </w:pPr>
     </w:p>
     <w:p>
       <w:pPr>
@@ -6622,9 +6660,8 @@
         <w:pStyle w:val="HWP0"/>
         <w:spacing w:line="328" w:lineRule="auto"/>
         <w:ind w:left="66" w:hanging="66"/>
-        <w:jc w:val="center"/>
-        <w:rPr>
-          <w:rFonts w:ascii="휴먼명조" w:eastAsia="휴먼명조" w:hAnsi="휴먼명조"/>
+        <w:rPr>
+          <w:rFonts w:ascii="휴먼명조" w:eastAsia="휴먼명조" w:hAnsi="휴먼명조" w:hint="eastAsia"/>
           <w:sz w:val="24"/>
           <w:lang w:eastAsia="ko-KR"/>
         </w:rPr>
@@ -6820,9 +6857,9 @@
                               <w:tblLook w:val="04A0" w:firstRow="1" w:lastRow="0" w:firstColumn="1" w:lastColumn="0" w:noHBand="0" w:noVBand="1"/>
                             </w:tblPr>
                             <w:tblGrid>
-                              <w:gridCol w:w="981"/>
+                              <w:gridCol w:w="980"/>
                               <w:gridCol w:w="1266"/>
-                              <w:gridCol w:w="3097"/>
+                              <w:gridCol w:w="3096"/>
                             </w:tblGrid>
                             <w:tr>
                               <w:trPr>
@@ -6832,10 +6869,10 @@
                                 <w:tcPr>
                                   <w:tcW w:w="979" w:type="dxa"/>
                                   <w:tcBorders>
-                                    <w:top w:val="single" w:sz="2" w:space="0" w:color="000000"/>
-                                    <w:left w:val="single" w:sz="2" w:space="0" w:color="000000"/>
-                                    <w:bottom w:val="single" w:sz="2" w:space="0" w:color="000000"/>
-                                    <w:right w:val="single" w:sz="2" w:space="0" w:color="000000"/>
+                                    <w:top w:val="single" w:sz="4" w:space="0" w:color="auto"/>
+                                    <w:left w:val="single" w:sz="4" w:space="0" w:color="auto"/>
+                                    <w:bottom w:val="single" w:sz="4" w:space="0" w:color="auto"/>
+                                    <w:right w:val="single" w:sz="4" w:space="0" w:color="auto"/>
                                   </w:tcBorders>
                                   <w:shd w:val="clear" w:color="auto" w:fill="FFFFFF"/>
                                   <w:vAlign w:val="center"/>
@@ -6867,7 +6904,7 @@
                                   <w:tcW w:w="1264" w:type="dxa"/>
                                   <w:tcBorders>
                                     <w:top w:val="single" w:sz="2" w:space="0" w:color="000000"/>
-                                    <w:left w:val="single" w:sz="2" w:space="0" w:color="000000"/>
+                                    <w:left w:val="single" w:sz="4" w:space="0" w:color="auto"/>
                                     <w:bottom w:val="single" w:sz="2" w:space="0" w:color="000000"/>
                                     <w:right w:val="single" w:sz="2" w:space="0" w:color="000000"/>
                                   </w:tcBorders>
@@ -6999,9 +7036,9 @@
                         <w:tblLook w:val="04A0" w:firstRow="1" w:lastRow="0" w:firstColumn="1" w:lastColumn="0" w:noHBand="0" w:noVBand="1"/>
                       </w:tblPr>
                       <w:tblGrid>
-                        <w:gridCol w:w="981"/>
+                        <w:gridCol w:w="980"/>
                         <w:gridCol w:w="1266"/>
-                        <w:gridCol w:w="3097"/>
+                        <w:gridCol w:w="3096"/>
                       </w:tblGrid>
                       <w:tr>
                         <w:trPr>
@@ -7011,10 +7048,10 @@
                           <w:tcPr>
                             <w:tcW w:w="979" w:type="dxa"/>
                             <w:tcBorders>
-                              <w:top w:val="single" w:sz="2" w:space="0" w:color="000000"/>
-                              <w:left w:val="single" w:sz="2" w:space="0" w:color="000000"/>
-                              <w:bottom w:val="single" w:sz="2" w:space="0" w:color="000000"/>
-                              <w:right w:val="single" w:sz="2" w:space="0" w:color="000000"/>
+                              <w:top w:val="single" w:sz="4" w:space="0" w:color="auto"/>
+                              <w:left w:val="single" w:sz="4" w:space="0" w:color="auto"/>
+                              <w:bottom w:val="single" w:sz="4" w:space="0" w:color="auto"/>
+                              <w:right w:val="single" w:sz="4" w:space="0" w:color="auto"/>
                             </w:tcBorders>
                             <w:shd w:val="clear" w:color="auto" w:fill="FFFFFF"/>
                             <w:vAlign w:val="center"/>
@@ -7046,7 +7083,7 @@
                             <w:tcW w:w="1264" w:type="dxa"/>
                             <w:tcBorders>
                               <w:top w:val="single" w:sz="2" w:space="0" w:color="000000"/>
-                              <w:left w:val="single" w:sz="2" w:space="0" w:color="000000"/>
+                              <w:left w:val="single" w:sz="4" w:space="0" w:color="auto"/>
                               <w:bottom w:val="single" w:sz="2" w:space="0" w:color="000000"/>
                               <w:right w:val="single" w:sz="2" w:space="0" w:color="000000"/>
                             </w:tcBorders>
@@ -7230,13 +7267,10 @@
           <w:sz w:val="24"/>
         </w:rPr>
       </w:pPr>
-      <w:r>
-        <w:br w:type="page"/>
-      </w:r>
     </w:p>
     <w:tbl>
       <w:tblPr>
-        <w:tblW w:w="9865" w:type="dxa"/>
+        <w:tblW w:w="9866" w:type="dxa"/>
         <w:tblInd w:w="-7" w:type="dxa"/>
         <w:tblLayout w:type="fixed"/>
         <w:tblCellMar>
@@ -7248,7 +7282,7 @@
       <w:tblGrid>
         <w:gridCol w:w="1397"/>
         <w:gridCol w:w="141"/>
-        <w:gridCol w:w="8327"/>
+        <w:gridCol w:w="8328"/>
       </w:tblGrid>
       <w:tr>
         <w:trPr>
@@ -7341,23 +7375,10 @@
         </w:tc>
       </w:tr>
     </w:tbl>
-    <w:p>
-      <w:pPr>
-        <w:pStyle w:val="HWP0"/>
-        <w:spacing w:line="240" w:lineRule="auto"/>
-        <w:textAlignment w:val="center"/>
-        <w:rPr>
-          <w:rFonts w:ascii="함초롬돋움" w:eastAsia="함초롬돋움" w:hAnsi="함초롬돋움"/>
-          <w:b/>
-          <w:sz w:val="24"/>
-          <w:lang w:eastAsia="ko-KR"/>
-        </w:rPr>
-      </w:pPr>
-    </w:p>
     <w:tbl>
       <w:tblPr>
+        <w:tblpPr w:leftFromText="142" w:rightFromText="142" w:vertAnchor="text" w:horzAnchor="margin" w:tblpY="471"/>
         <w:tblW w:w="9865" w:type="dxa"/>
-        <w:tblInd w:w="-3" w:type="dxa"/>
         <w:tblLayout w:type="fixed"/>
         <w:tblCellMar>
           <w:left w:w="0" w:type="dxa"/>
@@ -7371,6 +7392,7 @@
       <w:tr>
         <w:trPr>
           <w:cantSplit/>
+          <w:trHeight w:val="4673"/>
         </w:trPr>
         <w:tc>
           <w:tcPr>
@@ -7405,7 +7427,6 @@
                 <w:sz w:val="28"/>
                 <w:lang w:eastAsia="ko-KR"/>
               </w:rPr>
-              <w:lastRenderedPageBreak/>
               <w:t xml:space="preserve">【 개인정보 </w:t>
             </w:r>
             <w:proofErr w:type="spellStart"/>
@@ -8276,7 +8297,18 @@
                 <w:sz w:val="26"/>
                 <w:lang w:eastAsia="ko-KR"/>
               </w:rPr>
-              <w:t xml:space="preserve"> 것에 동의합니다.</w:t>
+              <w:t xml:space="preserve"> </w:t>
+            </w:r>
+            <w:r>
+              <w:rPr>
+                <w:rFonts w:ascii="함초롬돋움" w:eastAsia="함초롬돋움" w:hAnsi="함초롬돋움"/>
+                <w:b/>
+                <w:spacing w:val="-17"/>
+                <w:sz w:val="26"/>
+                <w:lang w:eastAsia="ko-KR"/>
+              </w:rPr>
+              <w:lastRenderedPageBreak/>
+              <w:t>것에 동의합니다.</w:t>
             </w:r>
           </w:p>
           <w:p>
@@ -8315,7 +8347,6 @@
                 <w:sz w:val="24"/>
                 <w:lang w:eastAsia="ko-KR"/>
               </w:rPr>
-              <w:lastRenderedPageBreak/>
               <w:t>( 동의함</w:t>
             </w:r>
             <w:proofErr w:type="gramEnd"/>
@@ -8502,7 +8533,7 @@
               <mc:AlternateContent>
                 <mc:Choice Requires="wpi">
                   <w:drawing>
-                    <wp:anchor distT="0" distB="0" distL="114300" distR="114300" simplePos="0" relativeHeight="251661312" behindDoc="0" locked="0" layoutInCell="1" allowOverlap="1" wp14:anchorId="2BFB2972" wp14:editId="5B056670">
+                    <wp:anchor distT="0" distB="0" distL="114300" distR="114300" simplePos="0" relativeHeight="251662336" behindDoc="0" locked="0" layoutInCell="1" allowOverlap="1" wp14:anchorId="21F34FE9" wp14:editId="0E4D7517">
                       <wp:simplePos x="0" y="0"/>
                       <wp:positionH relativeFrom="column">
                         <wp:posOffset>6035790</wp:posOffset>
@@ -8533,7 +8564,26 @@
                 </mc:Choice>
                 <mc:Fallback>
                   <w:pict>
-                    <v:shape w14:anchorId="06F34690" id="잉크 9" o:spid="_x0000_s1026" type="#_x0000_t75" style="position:absolute;margin-left:474.9pt;margin-top:-17.2pt;width:23.5pt;height:33.35pt;z-index:251661312;visibility:visible;mso-wrap-style:square;mso-wrap-distance-left:9pt;mso-wrap-distance-top:0;mso-wrap-distance-right:9pt;mso-wrap-distance-bottom:0;mso-position-horizontal:absolute;mso-position-horizontal-relative:text;mso-position-vertical:absolute;mso-position-vertical-relative:text" o:gfxdata="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">
+                    <v:shapetype w14:anchorId="6C7E129C" id="_x0000_t75" coordsize="21600,21600" o:spt="75" o:preferrelative="t" path="m@4@5l@4@11@9@11@9@5xe" filled="f" stroked="f">
+                      <v:stroke joinstyle="miter"/>
+                      <v:formulas>
+                        <v:f eqn="if lineDrawn pixelLineWidth 0"/>
+                        <v:f eqn="sum @0 1 0"/>
+                        <v:f eqn="sum 0 0 @1"/>
+                        <v:f eqn="prod @2 1 2"/>
+                        <v:f eqn="prod @3 21600 pixelWidth"/>
+                        <v:f eqn="prod @3 21600 pixelHeight"/>
+                        <v:f eqn="sum @0 0 1"/>
+                        <v:f eqn="prod @6 1 2"/>
+                        <v:f eqn="prod @7 21600 pixelWidth"/>
+                        <v:f eqn="sum @8 21600 0"/>
+                        <v:f eqn="prod @7 21600 pixelHeight"/>
+                        <v:f eqn="sum @10 21600 0"/>
+                      </v:formulas>
+                      <v:path o:extrusionok="f" gradientshapeok="t" o:connecttype="rect"/>
+                      <o:lock v:ext="edit" aspectratio="t"/>
+                    </v:shapetype>
+                    <v:shape id="잉크 9" o:spid="_x0000_s1026" type="#_x0000_t75" style="position:absolute;margin-left:474.9pt;margin-top:-17.2pt;width:23.5pt;height:33.35pt;z-index:251662336;visibility:visible;mso-wrap-style:square;mso-wrap-distance-left:9pt;mso-wrap-distance-top:0;mso-wrap-distance-right:9pt;mso-wrap-distance-bottom:0;mso-position-horizontal:absolute;mso-position-horizontal-relative:text;mso-position-vertical:absolute;mso-position-vertical-relative:text" o:gfxdata="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">
                       <v:imagedata r:id="rId14" o:title=""/>
                     </v:shape>
                   </w:pict>
@@ -8654,6 +8704,19 @@
         </w:tc>
       </w:tr>
     </w:tbl>
+    <w:p>
+      <w:pPr>
+        <w:pStyle w:val="HWP0"/>
+        <w:spacing w:line="240" w:lineRule="auto"/>
+        <w:textAlignment w:val="center"/>
+        <w:rPr>
+          <w:rFonts w:ascii="함초롬돋움" w:eastAsia="함초롬돋움" w:hAnsi="함초롬돋움"/>
+          <w:b/>
+          <w:sz w:val="24"/>
+          <w:lang w:eastAsia="ko-KR"/>
+        </w:rPr>
+      </w:pPr>
+    </w:p>
     <w:p>
       <w:pPr>
         <w:pStyle w:val="HWP0"/>

</xml_diff>